<commit_message>
edit Water_Consumption_Report.docx: weekly hose car wash, first-person, confident tone, strip abstract/conclusion/recommendations
Agent-Logs-Url: https://github.com/nsambatwalha-afk/g6-analysis-tool/sessions/eaf9776b-3b17-47c7-a92d-424f4ec46a12

Co-authored-by: nsambatwalha-afk <266694608+nsambatwalha-afk@users.noreply.github.com>
</commit_message>
<xml_diff>
--- a/Water_Consumption_Report.docx
+++ b/Water_Consumption_Report.docx
@@ -9,7 +9,7 @@
         <w:jc w:val="center"/>
       </w:pPr>
       <w:r>
-        <w:t>Estimated Water Consumption from Direct and Indirect Use</w:t>
+        <w:t xml:space="preserve">Estimated Daily Water Usage — Direct and Indirect</w:t>
       </w:r>
     </w:p>
     <w:p>
@@ -24,37 +24,7 @@
           <w:i w:val="0"/>
           <w:sz w:val="22"/>
         </w:rPr>
-        <w:t>Student: [Your Name]</w:t>
-      </w:r>
-    </w:p>
-    <w:p>
-      <w:pPr>
-        <w:spacing w:after="40"/>
-        <w:jc w:val="center"/>
-      </w:pPr>
-      <w:r>
-        <w:rPr>
-          <w:rFonts w:ascii="Calibri" w:hAnsi="Calibri"/>
-          <w:b w:val="0"/>
-          <w:i w:val="0"/>
-          <w:sz w:val="22"/>
-        </w:rPr>
-        <w:t>Course/Unit: [Course Title]</w:t>
-      </w:r>
-    </w:p>
-    <w:p>
-      <w:pPr>
-        <w:spacing w:after="40"/>
-        <w:jc w:val="center"/>
-      </w:pPr>
-      <w:r>
-        <w:rPr>
-          <w:rFonts w:ascii="Calibri" w:hAnsi="Calibri"/>
-          <w:b w:val="0"/>
-          <w:i w:val="0"/>
-          <w:sz w:val="22"/>
-        </w:rPr>
-        <w:t>Institution: [University Name]</w:t>
+        <w:t xml:space="preserve">Name: [Your Name]</w:t>
       </w:r>
     </w:p>
     <w:p>
@@ -79,97 +49,7 @@
         <w:spacing w:before="240" w:after="80"/>
       </w:pPr>
       <w:r>
-        <w:t>Abstract</w:t>
-      </w:r>
-    </w:p>
-    <w:p>
-      <w:pPr>
-        <w:spacing w:after="120"/>
-      </w:pPr>
-      <w:r>
-        <w:rPr>
-          <w:rFonts w:ascii="Calibri" w:hAnsi="Calibri"/>
-          <w:b w:val="0"/>
-          <w:i w:val="0"/>
-          <w:sz w:val="22"/>
-        </w:rPr>
-        <w:t>This report estimates personal water consumption from direct household activities (showering, toilet flushing, car washing, and laundry) and indirect water use embedded in food choices (virtual water). Using standard engineering assumptions for flow rates, appliance water intensity, and published global-average water footprint factors for poultry-based meals, the results indicate that indirect (dietary) water use can exceed direct household use by an order of magnitude. A sensitivity range is presented, particularly for car washing method and shower flow rate, which are the largest uncertainties.</w:t>
-      </w:r>
-    </w:p>
-    <w:p>
-      <w:pPr>
-        <w:pStyle w:val="Heading1"/>
-        <w:spacing w:before="240" w:after="80"/>
-      </w:pPr>
-      <w:r>
-        <w:t>1. Introduction</w:t>
-      </w:r>
-    </w:p>
-    <w:p>
-      <w:pPr>
-        <w:spacing w:after="120"/>
-      </w:pPr>
-      <w:r>
-        <w:rPr>
-          <w:rFonts w:ascii="Calibri" w:hAnsi="Calibri"/>
-          <w:b w:val="0"/>
-          <w:i w:val="0"/>
-          <w:sz w:val="22"/>
-        </w:rPr>
-        <w:t>Water consumption occurs in two major forms:</w:t>
-      </w:r>
-    </w:p>
-    <w:p>
-      <w:pPr>
-        <w:pStyle w:val="ListBullet"/>
-        <w:spacing w:after="40"/>
-      </w:pPr>
-      <w:r>
-        <w:rPr>
-          <w:rFonts w:ascii="Calibri" w:hAnsi="Calibri"/>
-          <w:b w:val="0"/>
-          <w:i w:val="0"/>
-          <w:sz w:val="22"/>
-        </w:rPr>
-        <w:t>Direct water use: physically withdrawn and used at home (e.g., bathing, flushing).</w:t>
-      </w:r>
-    </w:p>
-    <w:p>
-      <w:pPr>
-        <w:pStyle w:val="ListBullet"/>
-        <w:spacing w:after="40"/>
-      </w:pPr>
-      <w:r>
-        <w:rPr>
-          <w:rFonts w:ascii="Calibri" w:hAnsi="Calibri"/>
-          <w:b w:val="0"/>
-          <w:i w:val="0"/>
-          <w:sz w:val="22"/>
-        </w:rPr>
-        <w:t>Indirect water use (virtual water / water footprint): water used along supply chains to produce consumed goods, especially food.</w:t>
-      </w:r>
-    </w:p>
-    <w:p>
-      <w:pPr>
-        <w:spacing w:after="120"/>
-      </w:pPr>
-      <w:r>
-        <w:rPr>
-          <w:rFonts w:ascii="Calibri" w:hAnsi="Calibri"/>
-          <w:b w:val="0"/>
-          <w:i w:val="0"/>
-          <w:sz w:val="22"/>
-        </w:rPr>
-        <w:t>For many individuals, diet-related indirect water dominates total water footprint, particularly when animal protein is frequently consumed.</w:t>
-      </w:r>
-    </w:p>
-    <w:p>
-      <w:pPr>
-        <w:pStyle w:val="Heading1"/>
-        <w:spacing w:before="240" w:after="80"/>
-      </w:pPr>
-      <w:r>
-        <w:t>2. Provided Personal Activity Data (User Inputs)</w:t>
+        <w:t xml:space="preserve">1. My Daily Activities</w:t>
       </w:r>
     </w:p>
     <w:p>
@@ -214,7 +94,7 @@
           <w:i w:val="0"/>
           <w:sz w:val="22"/>
         </w:rPr>
-        <w:t>Car washing: once per day</w:t>
+        <w:t xml:space="preserve">Car washing: once per week (by hose)</w:t>
       </w:r>
     </w:p>
     <w:p>
@@ -253,21 +133,7 @@
         <w:spacing w:before="240" w:after="80"/>
       </w:pPr>
       <w:r>
-        <w:t>3. Methodology and Assumptions</w:t>
-      </w:r>
-    </w:p>
-    <w:p>
-      <w:pPr>
-        <w:spacing w:after="120"/>
-      </w:pPr>
-      <w:r>
-        <w:rPr>
-          <w:rFonts w:ascii="Calibri" w:hAnsi="Calibri"/>
-          <w:b w:val="0"/>
-          <w:i w:val="0"/>
-          <w:sz w:val="22"/>
-        </w:rPr>
-        <w:t>Because device efficiencies (low-flow showerhead, toilet flush volume, washing machine type, car wash method) were not specified, the report uses typical values and includes a sensitivity range where it matters most.</w:t>
+        <w:t xml:space="preserve">2. Calculation</w:t>
       </w:r>
     </w:p>
     <w:p>
@@ -276,7 +142,7 @@
         <w:spacing w:before="240" w:after="80"/>
       </w:pPr>
       <w:r>
-        <w:t>3.1  Direct Water Use Assumptions (Engineering Typical Values)</w:t>
+        <w:t xml:space="preserve">2.1  Direct Water Use</w:t>
       </w:r>
     </w:p>
     <w:p>
@@ -449,7 +315,7 @@
         <w:spacing w:before="240" w:after="80"/>
       </w:pPr>
       <w:r>
-        <w:t>C)  Car Washing (Largest Uncertainty)</w:t>
+        <w:t xml:space="preserve">C)  Car Washing</w:t>
       </w:r>
     </w:p>
     <w:p>
@@ -463,122 +329,33 @@
           <w:i w:val="0"/>
           <w:sz w:val="22"/>
         </w:rPr>
-        <w:t>Car washing water depends strongly on method. Typical ranges are shown below, and a base-case of 350 L/wash (hose wash mid-range) is used because daily car washing most commonly implies open-hose use.</w:t>
+        <w:t xml:space="preserve">I wash my car by hose once a week. I use 350 L/wash as the base estimate for an uncontrolled hose wash.</w:t>
       </w:r>
     </w:p>
-    <w:tbl>
-      <w:tblPr>
-        <w:tblStyle w:val="TableGrid"/>
-        <w:tblW w:type="auto" w:w="0"/>
+    <w:p>
+      <w:pPr>
+        <w:pStyle w:val="ListBullet"/>
+      </w:pPr>
+      <w:r>
+        <w:t xml:space="preserve">Hose wash (uncontrolled): 350 L/wash, once per week</w:t>
+      </w:r>
+    </w:p>
+    <w:p>
+      <w:r>
+        <w:t xml:space="preserve">Car wash water per day (average):</w:t>
+      </w:r>
+    </w:p>
+    <w:p>
+      <w:pPr>
+        <w:spacing w:before="80" w:after="120"/>
         <w:jc w:val="center"/>
-        <w:tblLook w:firstColumn="1" w:firstRow="1" w:lastColumn="0" w:lastRow="0" w:noHBand="0" w:noVBand="1" w:val="04A0"/>
-      </w:tblPr>
-      <w:tblGrid>
-        <w:gridCol w:w="4549"/>
-        <w:gridCol w:w="4549"/>
-      </w:tblGrid>
-      <w:tr>
-        <w:tc>
-          <w:tcPr>
-            <w:tcW w:type="dxa" w:w="4549"/>
-          </w:tcPr>
-          <w:p>
-            <w:r>
-              <w:rPr>
-                <w:rFonts w:ascii="Calibri" w:hAnsi="Calibri"/>
-                <w:b/>
-                <w:i w:val="0"/>
-                <w:sz w:val="22"/>
-              </w:rPr>
-              <w:t>Method</w:t>
-            </w:r>
-          </w:p>
-        </w:tc>
-        <w:tc>
-          <w:tcPr>
-            <w:tcW w:type="dxa" w:w="4549"/>
-          </w:tcPr>
-          <w:p>
-            <w:r>
-              <w:rPr>
-                <w:rFonts w:ascii="Calibri" w:hAnsi="Calibri"/>
-                <w:b/>
-                <w:i w:val="0"/>
-                <w:sz w:val="22"/>
-              </w:rPr>
-              <w:t>Water Use (L/wash)</w:t>
-            </w:r>
-          </w:p>
-        </w:tc>
-      </w:tr>
-      <w:tr>
-        <w:tc>
-          <w:tcPr>
-            <w:tcW w:type="dxa" w:w="4549"/>
-          </w:tcPr>
-          <w:p>
-            <w:r>
-              <w:t>Bucket wash</w:t>
-            </w:r>
-          </w:p>
-        </w:tc>
-        <w:tc>
-          <w:tcPr>
-            <w:tcW w:type="dxa" w:w="4549"/>
-          </w:tcPr>
-          <w:p>
-            <w:r>
-              <w:t>~50–80</w:t>
-            </w:r>
-          </w:p>
-        </w:tc>
-      </w:tr>
-      <w:tr>
-        <w:tc>
-          <w:tcPr>
-            <w:tcW w:type="dxa" w:w="4549"/>
-          </w:tcPr>
-          <w:p>
-            <w:r>
-              <w:t>Hose wash (uncontrolled)</w:t>
-            </w:r>
-          </w:p>
-        </w:tc>
-        <w:tc>
-          <w:tcPr>
-            <w:tcW w:type="dxa" w:w="4549"/>
-          </w:tcPr>
-          <w:p>
-            <w:r>
-              <w:t>~300–500  ← base case mid: 350</w:t>
-            </w:r>
-          </w:p>
-        </w:tc>
-      </w:tr>
-      <w:tr>
-        <w:tc>
-          <w:tcPr>
-            <w:tcW w:type="dxa" w:w="4549"/>
-          </w:tcPr>
-          <w:p>
-            <w:r>
-              <w:t>Commercial wash (partial recycling)</w:t>
-            </w:r>
-          </w:p>
-        </w:tc>
-        <w:tc>
-          <w:tcPr>
-            <w:tcW w:type="dxa" w:w="4549"/>
-          </w:tcPr>
-          <w:p>
-            <w:r>
-              <w:t>~120–200</w:t>
-            </w:r>
-          </w:p>
-        </w:tc>
-      </w:tr>
-    </w:tbl>
-    <w:p/>
+      </w:pPr>
+      <m:oMath>
+        <m:r>
+          <m:t>Car wash water = 350 ÷ 7 = 50 L/day</m:t>
+        </m:r>
+      </m:oMath>
+    </w:p>
     <w:p>
       <w:pPr>
         <w:pStyle w:val="Heading3"/>
@@ -670,7 +447,7 @@
         <w:spacing w:before="240" w:after="80"/>
       </w:pPr>
       <w:r>
-        <w:t>3.2  Indirect Water Use (Food / Virtual Water) Assumptions</w:t>
+        <w:t xml:space="preserve">2.2  Indirect Water Use (Virtual Water)</w:t>
       </w:r>
     </w:p>
     <w:p>
@@ -684,7 +461,7 @@
           <w:i w:val="0"/>
           <w:sz w:val="22"/>
         </w:rPr>
-        <w:t>The diet described is two meals per day of mainly fast-food chicken. Indirect water depends on portion size and the embedded water in chicken plus sides (bread, fries, sauces).</w:t>
+        <w:t xml:space="preserve">I eat two meals per day of mainly fast-food chicken. I apply the following water footprint factors:</w:t>
       </w:r>
     </w:p>
     <w:p>
@@ -698,7 +475,7 @@
           <w:i w:val="0"/>
           <w:sz w:val="22"/>
         </w:rPr>
-        <w:t>Key factor (global average, water footprint literature):</w:t>
+        <w:t xml:space="preserve">Virtual water factor (global average):</w:t>
       </w:r>
     </w:p>
     <w:p>
@@ -814,7 +591,7 @@
           <w:i w:val="0"/>
           <w:sz w:val="22"/>
         </w:rPr>
-        <w:t>For a full fast-food meal (including bun, fries, condiments) a conservative meal multiplier is applied, yielding approximately 1,800 L/meal:</w:t>
+        <w:t xml:space="preserve">Applying a meal multiplier that accounts for bun, fries, and condiments gives 1,800 L/meal:</w:t>
       </w:r>
     </w:p>
     <w:p>
@@ -845,38 +622,6 @@
           <m:t>3 600 L/day</m:t>
         </m:r>
       </m:oMath>
-    </w:p>
-    <w:p>
-      <w:pPr>
-        <w:spacing w:after="120"/>
-      </w:pPr>
-      <w:r>
-        <w:rPr>
-          <w:rFonts w:ascii="Calibri" w:hAnsi="Calibri"/>
-          <w:b w:val="0"/>
-          <w:i w:val="0"/>
-          <w:sz w:val="22"/>
-        </w:rPr>
-        <w:t>Note: This 'whole meal' factor is intentionally conservative and should be refined if exact meal composition and portion sizes are known.</w:t>
-      </w:r>
-    </w:p>
-    <w:p>
-      <w:pPr>
-        <w:pStyle w:val="Heading1"/>
-        <w:spacing w:before="240" w:after="80"/>
-      </w:pPr>
-      <w:r>
-        <w:t>4. Calculations and Results</w:t>
-      </w:r>
-    </w:p>
-    <w:p>
-      <w:pPr>
-        <w:pStyle w:val="Heading2"/>
-        <w:spacing w:before="240" w:after="80"/>
-      </w:pPr>
-      <w:r>
-        <w:t>4.1  Direct Water Use (Base Case)</w:t>
-      </w:r>
     </w:p>
     <w:tbl>
       <w:tblPr>
@@ -1058,7 +803,7 @@
           </w:tcPr>
           <w:p>
             <w:r>
-              <w:t>Hose wash mid</w:t>
+              <w:t>Hose wash, 350 L/wash, 1×/week</w:t>
             </w:r>
           </w:p>
         </w:tc>
@@ -1068,7 +813,7 @@
           </w:tcPr>
           <w:p>
             <w:r>
-              <w:t>—</w:t>
+              <w:t>350 ÷ 7</w:t>
             </w:r>
           </w:p>
         </w:tc>
@@ -1078,7 +823,7 @@
           </w:tcPr>
           <w:p>
             <w:r>
-              <w:t>350</w:t>
+              <w:t>50</w:t>
             </w:r>
           </w:p>
         </w:tc>
@@ -1184,13 +929,12 @@
                 <w:i w:val="0"/>
                 <w:sz w:val="22"/>
               </w:rPr>
-              <w:t>454</w:t>
+              <w:t>154</w:t>
             </w:r>
           </w:p>
         </w:tc>
       </w:tr>
     </w:tbl>
-    <w:p/>
     <w:p>
       <w:pPr>
         <w:spacing w:after="120"/>
@@ -1202,7 +946,7 @@
           <w:i w:val="0"/>
           <w:sz w:val="22"/>
         </w:rPr>
-        <w:t>Converting to weekly and annual figures:</w:t>
+        <w:t xml:space="preserve">Weekly and annual figures (direct):</w:t>
       </w:r>
     </w:p>
     <w:p>
@@ -1212,25 +956,7 @@
       </w:pPr>
       <m:oMath>
         <m:r>
-          <m:t>454 L/day</m:t>
-        </m:r>
-        <m:r>
-          <m:t> × </m:t>
-        </m:r>
-        <m:r>
-          <m:t>7</m:t>
-        </m:r>
-        <m:r>
-          <m:t> = </m:t>
-        </m:r>
-        <m:r>
-          <m:t>3 178 L/week</m:t>
-        </m:r>
-        <m:r>
-          <m:t> ≈ </m:t>
-        </m:r>
-        <m:r>
-          <m:t>3.18 m³/week</m:t>
+          <m:t>154 L/day × 7 = 1 078 L/week ≈ 1.08 m³/week</m:t>
         </m:r>
       </m:oMath>
     </w:p>
@@ -1241,36 +967,9 @@
       </w:pPr>
       <m:oMath>
         <m:r>
-          <m:t>454 L/day</m:t>
-        </m:r>
-        <m:r>
-          <m:t> × </m:t>
-        </m:r>
-        <m:r>
-          <m:t>365</m:t>
-        </m:r>
-        <m:r>
-          <m:t> = </m:t>
-        </m:r>
-        <m:r>
-          <m:t>165 710 L/year</m:t>
-        </m:r>
-        <m:r>
-          <m:t> ≈ </m:t>
-        </m:r>
-        <m:r>
-          <m:t>165.7 m³/year</m:t>
+          <m:t>154 L/day × 365 = 56 210 L/year ≈ 56.2 m³/year</m:t>
         </m:r>
       </m:oMath>
-    </w:p>
-    <w:p>
-      <w:pPr>
-        <w:pStyle w:val="Heading2"/>
-        <w:spacing w:before="240" w:after="80"/>
-      </w:pPr>
-      <w:r>
-        <w:t>4.2  Indirect Water Use (Food / Virtual Water, Base Case)</w:t>
-      </w:r>
     </w:p>
     <w:tbl>
       <w:tblPr>
@@ -1394,7 +1093,6 @@
         </w:tc>
       </w:tr>
     </w:tbl>
-    <w:p/>
     <w:p>
       <w:pPr>
         <w:spacing w:after="120"/>
@@ -1406,7 +1104,7 @@
           <w:i w:val="0"/>
           <w:sz w:val="22"/>
         </w:rPr>
-        <w:t>Converting to weekly and annual figures:</w:t>
+        <w:t xml:space="preserve">Weekly and annual figures (indirect):</w:t>
       </w:r>
     </w:p>
     <w:p>
@@ -1466,15 +1164,6 @@
           <m:t>1 314 m³/year</m:t>
         </m:r>
       </m:oMath>
-    </w:p>
-    <w:p>
-      <w:pPr>
-        <w:pStyle w:val="Heading2"/>
-        <w:spacing w:before="240" w:after="80"/>
-      </w:pPr>
-      <w:r>
-        <w:t>4.3  Combined Total Water Footprint (Base Case)</w:t>
-      </w:r>
     </w:p>
     <w:tbl>
       <w:tblPr>
@@ -1572,7 +1261,7 @@
           </w:tcPr>
           <w:p>
             <w:r>
-              <w:t>454</w:t>
+              <w:t>154</w:t>
             </w:r>
           </w:p>
         </w:tc>
@@ -1582,7 +1271,7 @@
           </w:tcPr>
           <w:p>
             <w:r>
-              <w:t>3 178</w:t>
+              <w:t>1 078</w:t>
             </w:r>
           </w:p>
         </w:tc>
@@ -1592,7 +1281,7 @@
           </w:tcPr>
           <w:p>
             <w:r>
-              <w:t>165 710</w:t>
+              <w:t>56 210</w:t>
             </w:r>
           </w:p>
         </w:tc>
@@ -1668,7 +1357,7 @@
                 <w:i w:val="0"/>
                 <w:sz w:val="22"/>
               </w:rPr>
-              <w:t>4 054</w:t>
+              <w:t>3 754</w:t>
             </w:r>
           </w:p>
         </w:tc>
@@ -1684,7 +1373,7 @@
                 <w:i w:val="0"/>
                 <w:sz w:val="22"/>
               </w:rPr>
-              <w:t>28 378</w:t>
+              <w:t>26 278</w:t>
             </w:r>
           </w:p>
         </w:tc>
@@ -1700,27 +1389,12 @@
                 <w:i w:val="0"/>
                 <w:sz w:val="22"/>
               </w:rPr>
-              <w:t>1 479 710</w:t>
+              <w:t>1 370 210</w:t>
             </w:r>
           </w:p>
         </w:tc>
       </w:tr>
     </w:tbl>
-    <w:p/>
-    <w:p>
-      <w:pPr>
-        <w:spacing w:after="120"/>
-      </w:pPr>
-      <w:r>
-        <w:rPr>
-          <w:rFonts w:ascii="Calibri" w:hAnsi="Calibri"/>
-          <w:b w:val="0"/>
-          <w:i/>
-          <w:sz w:val="22"/>
-        </w:rPr>
-        <w:t>Interpretation: Under base-case assumptions, indirect (dietary) water represents approximately 89% of the total daily water footprint.</w:t>
-      </w:r>
-    </w:p>
     <w:p>
       <w:pPr>
         <w:spacing w:before="80" w:after="120"/>
@@ -1728,25 +1402,7 @@
       </w:pPr>
       <m:oMath>
         <m:r>
-          <m:t>Total</m:t>
-        </m:r>
-        <m:r>
-          <m:t> = </m:t>
-        </m:r>
-        <m:r>
-          <m:t>Direct + Indirect</m:t>
-        </m:r>
-        <m:r>
-          <m:t> = </m:t>
-        </m:r>
-        <m:r>
-          <m:t>454 + 3 600</m:t>
-        </m:r>
-        <m:r>
-          <m:t> = </m:t>
-        </m:r>
-        <m:r>
-          <m:t>4 054 L/day</m:t>
+          <m:t>Total = Direct + Indirect = 154 + 3 600 = 3 754 L/day</m:t>
         </m:r>
       </m:oMath>
     </w:p>
@@ -1756,7 +1412,7 @@
         <w:spacing w:before="240" w:after="80"/>
       </w:pPr>
       <w:r>
-        <w:t>5. Sensitivity Analysis (Uncertainty Ranges)</w:t>
+        <w:t xml:space="preserve">3. Sensitivity Range</w:t>
       </w:r>
     </w:p>
     <w:p>
@@ -1770,7 +1426,7 @@
           <w:i w:val="0"/>
           <w:sz w:val="22"/>
         </w:rPr>
-        <w:t>Two assumptions can significantly shift results: car washing method and shower flow rate/duration.</w:t>
+        <w:t xml:space="preserve">The two main sources of variation are shower flow rate and hose water volume.</w:t>
       </w:r>
     </w:p>
     <w:p>
@@ -1779,7 +1435,7 @@
         <w:spacing w:before="240" w:after="80"/>
       </w:pPr>
       <w:r>
-        <w:t>5.1  Car Wash Sensitivity (L/day)</w:t>
+        <w:t xml:space="preserve">3.1  Car Wash Sensitivity (once per week by hose)</w:t>
       </w:r>
     </w:p>
     <w:p>
@@ -1794,7 +1450,7 @@
           <w:i w:val="0"/>
           <w:sz w:val="22"/>
         </w:rPr>
-        <w:t>Bucket wash: ~60 L/day</w:t>
+        <w:t xml:space="preserve">Low estimate: ~9 L/day (bucket wash, 60 L/wash ÷ 7 days)</w:t>
       </w:r>
     </w:p>
     <w:p>
@@ -1809,7 +1465,7 @@
           <w:i w:val="0"/>
           <w:sz w:val="22"/>
         </w:rPr>
-        <w:t>Commercial wash: ~150 L/day</w:t>
+        <w:t xml:space="preserve">Base estimate: ~50 L/day (hose wash, 350 L/wash ÷ 7 days)</w:t>
       </w:r>
     </w:p>
     <w:p>
@@ -1824,21 +1480,7 @@
           <w:i w:val="0"/>
           <w:sz w:val="22"/>
         </w:rPr>
-        <w:t>Hose wash (uncontrolled): ~350 L/day (base case) up to ~500 L/day</w:t>
-      </w:r>
-    </w:p>
-    <w:p>
-      <w:pPr>
-        <w:spacing w:after="120"/>
-      </w:pPr>
-      <w:r>
-        <w:rPr>
-          <w:rFonts w:ascii="Calibri" w:hAnsi="Calibri"/>
-          <w:b w:val="0"/>
-          <w:i w:val="0"/>
-          <w:sz w:val="22"/>
-        </w:rPr>
-        <w:t>This single variable can change direct water use by several hundred litres per day.</w:t>
+        <w:t xml:space="preserve">High estimate: ~71 L/day (hose wash, 500 L/wash ÷ 7 days)</w:t>
       </w:r>
     </w:p>
     <w:p>
@@ -1847,7 +1489,7 @@
         <w:spacing w:before="240" w:after="80"/>
       </w:pPr>
       <w:r>
-        <w:t>5.2  Shower Sensitivity (L/day)</w:t>
+        <w:t xml:space="preserve">3.2  Shower Sensitivity</w:t>
       </w:r>
     </w:p>
     <w:p>
@@ -1901,7 +1543,7 @@
         <w:spacing w:before="240" w:after="80"/>
       </w:pPr>
       <w:r>
-        <w:t>5.3  Range Summary (Direct Water Only)</w:t>
+        <w:t xml:space="preserve">3.3  Range Summary (Direct Water Only)</w:t>
       </w:r>
     </w:p>
     <w:tbl>
@@ -1983,7 +1625,7 @@
           </w:tcPr>
           <w:p>
             <w:r>
-              <w:t>48 (shower) + 18 (toilet) + 60 (bucket wash) + 14 (laundry)</w:t>
+              <w:t>48 (shower) + 18 (toilet) + 9 (bucket wash ÷7) + 14 (laundry)</w:t>
             </w:r>
           </w:p>
         </w:tc>
@@ -1993,7 +1635,7 @@
           </w:tcPr>
           <w:p>
             <w:r>
-              <w:t>~140</w:t>
+              <w:t>~89</w:t>
             </w:r>
           </w:p>
         </w:tc>
@@ -2015,7 +1657,7 @@
           </w:tcPr>
           <w:p>
             <w:r>
-              <w:t>108 (shower) + 18 (toilet) + 500 (hose wash) + 14 (laundry)</w:t>
+              <w:t>108 (shower) + 18 (toilet) + 71 (hose wash ÷7) + 14 (laundry)</w:t>
             </w:r>
           </w:p>
         </w:tc>
@@ -2025,549 +1667,13 @@
           </w:tcPr>
           <w:p>
             <w:r>
-              <w:t>~640</w:t>
+              <w:t>~211</w:t>
             </w:r>
           </w:p>
         </w:tc>
       </w:tr>
     </w:tbl>
     <w:p/>
-    <w:p>
-      <w:pPr>
-        <w:spacing w:after="120"/>
-      </w:pPr>
-      <w:r>
-        <w:rPr>
-          <w:rFonts w:ascii="Calibri" w:hAnsi="Calibri"/>
-          <w:b w:val="0"/>
-          <w:i w:val="0"/>
-          <w:sz w:val="22"/>
-        </w:rPr>
-        <w:t>Even at the low end, if meals remain chicken fast-food based, indirect water still dominates total consumption.</w:t>
-      </w:r>
-    </w:p>
-    <w:p>
-      <w:pPr>
-        <w:pStyle w:val="Heading1"/>
-        <w:spacing w:before="240" w:after="80"/>
-      </w:pPr>
-      <w:r>
-        <w:t>6. Discussion</w:t>
-      </w:r>
-    </w:p>
-    <w:p>
-      <w:pPr>
-        <w:spacing w:after="120"/>
-      </w:pPr>
-      <w:r>
-        <w:rPr>
-          <w:rFonts w:ascii="Calibri" w:hAnsi="Calibri"/>
-          <w:b w:val="0"/>
-          <w:i w:val="0"/>
-          <w:sz w:val="22"/>
-        </w:rPr>
-        <w:t>The calculations reveal a clear hierarchy of water impacts:</w:t>
-      </w:r>
-    </w:p>
-    <w:p>
-      <w:pPr>
-        <w:pStyle w:val="ListBullet"/>
-        <w:spacing w:after="40"/>
-      </w:pPr>
-      <w:r>
-        <w:rPr>
-          <w:rFonts w:ascii="Calibri" w:hAnsi="Calibri"/>
-          <w:b w:val="0"/>
-          <w:i w:val="0"/>
-          <w:sz w:val="22"/>
-        </w:rPr>
-        <w:t>Diet choice (indirect water) is the largest contributor, especially with animal-protein-heavy fast foods.</w:t>
-      </w:r>
-    </w:p>
-    <w:p>
-      <w:pPr>
-        <w:pStyle w:val="ListBullet"/>
-        <w:spacing w:after="40"/>
-      </w:pPr>
-      <w:r>
-        <w:rPr>
-          <w:rFonts w:ascii="Calibri" w:hAnsi="Calibri"/>
-          <w:b w:val="0"/>
-          <w:i w:val="0"/>
-          <w:sz w:val="22"/>
-        </w:rPr>
-        <w:t>Daily car washing can become the dominant direct use if performed with an open hose.</w:t>
-      </w:r>
-    </w:p>
-    <w:p>
-      <w:pPr>
-        <w:pStyle w:val="ListBullet"/>
-        <w:spacing w:after="40"/>
-      </w:pPr>
-      <w:r>
-        <w:rPr>
-          <w:rFonts w:ascii="Calibri" w:hAnsi="Calibri"/>
-          <w:b w:val="0"/>
-          <w:i w:val="0"/>
-          <w:sz w:val="22"/>
-        </w:rPr>
-        <w:t>Showering and toilet flushing are moderate contributors; savings are achievable through efficient fixtures.</w:t>
-      </w:r>
-    </w:p>
-    <w:p>
-      <w:pPr>
-        <w:pStyle w:val="ListBullet"/>
-        <w:spacing w:after="40"/>
-      </w:pPr>
-      <w:r>
-        <w:rPr>
-          <w:rFonts w:ascii="Calibri" w:hAnsi="Calibri"/>
-          <w:b w:val="0"/>
-          <w:i w:val="0"/>
-          <w:sz w:val="22"/>
-        </w:rPr>
-        <w:t>Laundry is relatively small when averaged to a daily figure at once per week.</w:t>
-      </w:r>
-    </w:p>
-    <w:p>
-      <w:pPr>
-        <w:spacing w:after="120"/>
-      </w:pPr>
-      <w:r>
-        <w:rPr>
-          <w:rFonts w:ascii="Calibri" w:hAnsi="Calibri"/>
-          <w:b w:val="0"/>
-          <w:i w:val="0"/>
-          <w:sz w:val="22"/>
-        </w:rPr>
-        <w:t>The indirect water estimates are global-average based and can vary significantly due to feed sources, farming practices, climate, and supply-chain efficiency. For a more locally accurate estimate, Uganda- or region-specific footprint data should be used where available.</w:t>
-      </w:r>
-    </w:p>
-    <w:p>
-      <w:pPr>
-        <w:pStyle w:val="Heading1"/>
-        <w:spacing w:before="240" w:after="80"/>
-      </w:pPr>
-      <w:r>
-        <w:t>7. Recommendations (Water Reduction Options)</w:t>
-      </w:r>
-    </w:p>
-    <w:p>
-      <w:pPr>
-        <w:pStyle w:val="Heading2"/>
-        <w:spacing w:before="240" w:after="80"/>
-      </w:pPr>
-      <w:r>
-        <w:t>7.1  Direct Water Savings</w:t>
-      </w:r>
-    </w:p>
-    <w:p>
-      <w:pPr>
-        <w:pStyle w:val="ListBullet"/>
-        <w:spacing w:after="40"/>
-      </w:pPr>
-      <w:r>
-        <w:rPr>
-          <w:rFonts w:ascii="Calibri" w:hAnsi="Calibri"/>
-          <w:b w:val="0"/>
-          <w:i w:val="0"/>
-          <w:sz w:val="22"/>
-        </w:rPr>
-        <w:t>Switch from open-hose to bucket car washing or use a shut-off nozzle: potential saving ~200–400 L/day.</w:t>
-      </w:r>
-    </w:p>
-    <w:p>
-      <w:pPr>
-        <w:pStyle w:val="ListBullet"/>
-        <w:spacing w:after="40"/>
-      </w:pPr>
-      <w:r>
-        <w:rPr>
-          <w:rFonts w:ascii="Calibri" w:hAnsi="Calibri"/>
-          <w:b w:val="0"/>
-          <w:i w:val="0"/>
-          <w:sz w:val="22"/>
-        </w:rPr>
-        <w:t>Install a low-flow showerhead and reduce shower duration by 2–4 minutes: save ~18–36 L/day.</w:t>
-      </w:r>
-    </w:p>
-    <w:p>
-      <w:pPr>
-        <w:pStyle w:val="ListBullet"/>
-        <w:spacing w:after="40"/>
-      </w:pPr>
-      <w:r>
-        <w:rPr>
-          <w:rFonts w:ascii="Calibri" w:hAnsi="Calibri"/>
-          <w:b w:val="0"/>
-          <w:i w:val="0"/>
-          <w:sz w:val="22"/>
-        </w:rPr>
-        <w:t>Use a dual-flush toilet or adjust cistern volume: save ~3–10 L/day depending on the current toilet.</w:t>
-      </w:r>
-    </w:p>
-    <w:p>
-      <w:pPr>
-        <w:pStyle w:val="Heading2"/>
-        <w:spacing w:before="240" w:after="80"/>
-      </w:pPr>
-      <w:r>
-        <w:t>7.2  Indirect (Diet) Water Savings</w:t>
-      </w:r>
-    </w:p>
-    <w:p>
-      <w:pPr>
-        <w:pStyle w:val="ListBullet"/>
-        <w:spacing w:after="40"/>
-      </w:pPr>
-      <w:r>
-        <w:rPr>
-          <w:rFonts w:ascii="Calibri" w:hAnsi="Calibri"/>
-          <w:b w:val="0"/>
-          <w:i w:val="0"/>
-          <w:sz w:val="22"/>
-        </w:rPr>
-        <w:t>Replace one chicken-based fast-food meal per day with a more plant-based option. Even partial shifts can reduce virtual water use by hundreds to thousands of litres per day depending on replacement foods.</w:t>
-      </w:r>
-    </w:p>
-    <w:p>
-      <w:pPr>
-        <w:pStyle w:val="Heading1"/>
-        <w:spacing w:before="240" w:after="80"/>
-      </w:pPr>
-      <w:r>
-        <w:t>8. Conclusion</w:t>
-      </w:r>
-    </w:p>
-    <w:p>
-      <w:pPr>
-        <w:spacing w:after="120"/>
-      </w:pPr>
-      <w:r>
-        <w:rPr>
-          <w:rFonts w:ascii="Calibri" w:hAnsi="Calibri"/>
-          <w:b w:val="0"/>
-          <w:i w:val="0"/>
-          <w:sz w:val="22"/>
-        </w:rPr>
-        <w:t>Based on typical engineering values and conservative food footprint assumptions, the estimated daily water footprint is:</w:t>
-      </w:r>
-    </w:p>
-    <w:p>
-      <w:pPr>
-        <w:pStyle w:val="ListBullet"/>
-        <w:spacing w:after="40"/>
-      </w:pPr>
-      <w:r>
-        <w:rPr>
-          <w:rFonts w:ascii="Calibri" w:hAnsi="Calibri"/>
-          <w:b w:val="0"/>
-          <w:i w:val="0"/>
-          <w:sz w:val="22"/>
-        </w:rPr>
-        <w:t>Direct use: ~454 L/day  (range ~140–640 L/day)</w:t>
-      </w:r>
-    </w:p>
-    <w:p>
-      <w:pPr>
-        <w:pStyle w:val="ListBullet"/>
-        <w:spacing w:after="40"/>
-      </w:pPr>
-      <w:r>
-        <w:rPr>
-          <w:rFonts w:ascii="Calibri" w:hAnsi="Calibri"/>
-          <w:b w:val="0"/>
-          <w:i w:val="0"/>
-          <w:sz w:val="22"/>
-        </w:rPr>
-        <w:t>Indirect food-related use: ~3,600 L/day  (dominant share)</w:t>
-      </w:r>
-    </w:p>
-    <w:p>
-      <w:pPr>
-        <w:pStyle w:val="ListBullet"/>
-        <w:spacing w:after="40"/>
-      </w:pPr>
-      <w:r>
-        <w:rPr>
-          <w:rFonts w:ascii="Calibri" w:hAnsi="Calibri"/>
-          <w:b w:val="0"/>
-          <w:i w:val="0"/>
-          <w:sz w:val="22"/>
-        </w:rPr>
-        <w:t>Combined: ~4,054 L/day ≈ 4.05 m³/day</w:t>
-      </w:r>
-    </w:p>
-    <w:p>
-      <w:pPr>
-        <w:spacing w:after="120"/>
-      </w:pPr>
-      <w:r>
-        <w:rPr>
-          <w:rFonts w:ascii="Calibri" w:hAnsi="Calibri"/>
-          <w:b w:val="0"/>
-          <w:i w:val="0"/>
-          <w:sz w:val="22"/>
-        </w:rPr>
-        <w:t>The most effective reduction strategies are (1) reducing the water intensity of daily car washing, and (2) moderating the frequency and portioning of chicken-based fast-food meals.</w:t>
-      </w:r>
-    </w:p>
-    <w:p>
-      <w:pPr>
-        <w:pStyle w:val="Heading1"/>
-        <w:spacing w:before="240" w:after="80"/>
-      </w:pPr>
-      <w:r>
-        <w:t>References</w:t>
-      </w:r>
-    </w:p>
-    <w:p>
-      <w:pPr>
-        <w:pStyle w:val="ListBullet"/>
-        <w:spacing w:after="40"/>
-      </w:pPr>
-      <w:r>
-        <w:rPr>
-          <w:rFonts w:ascii="Calibri" w:hAnsi="Calibri"/>
-          <w:b w:val="0"/>
-          <w:i w:val="0"/>
-          <w:sz w:val="22"/>
-        </w:rPr>
-        <w:t>Water Footprint Network (WFN): food and product water footprint concepts and data. Available at: waterfootprint.org</w:t>
-      </w:r>
-    </w:p>
-    <w:p>
-      <w:pPr>
-        <w:pStyle w:val="ListBullet"/>
-        <w:spacing w:after="40"/>
-      </w:pPr>
-      <w:r>
-        <w:rPr>
-          <w:rFonts w:ascii="Calibri" w:hAnsi="Calibri"/>
-          <w:b w:val="0"/>
-          <w:i w:val="0"/>
-          <w:sz w:val="22"/>
-        </w:rPr>
-        <w:t>Food and Agriculture Organisation (FAO): resources on livestock and water use. Available at: fao.org</w:t>
-      </w:r>
-    </w:p>
-    <w:p>
-      <w:pPr>
-        <w:pStyle w:val="ListBullet"/>
-        <w:spacing w:after="40"/>
-      </w:pPr>
-      <w:r>
-        <w:rPr>
-          <w:rFonts w:ascii="Calibri" w:hAnsi="Calibri"/>
-          <w:b w:val="0"/>
-          <w:i w:val="0"/>
-          <w:sz w:val="22"/>
-        </w:rPr>
-        <w:t>US EPA WaterSense: household fixture flow rates and conservation. Available at: epa.gov/watersense</w:t>
-      </w:r>
-    </w:p>
-    <w:p>
-      <w:pPr>
-        <w:pStyle w:val="ListBullet"/>
-        <w:spacing w:after="40"/>
-      </w:pPr>
-      <w:r>
-        <w:rPr>
-          <w:rFonts w:ascii="Calibri" w:hAnsi="Calibri"/>
-          <w:b w:val="0"/>
-          <w:i w:val="0"/>
-          <w:sz w:val="22"/>
-        </w:rPr>
-        <w:t>Academic literature on life-cycle water use in poultry production (peer-reviewed LCA studies).</w:t>
-      </w:r>
-    </w:p>
-    <w:p>
-      <w:pPr>
-        <w:pStyle w:val="ListBullet"/>
-        <w:spacing w:after="40"/>
-      </w:pPr>
-      <w:r>
-        <w:rPr>
-          <w:rFonts w:ascii="Calibri" w:hAnsi="Calibri"/>
-          <w:b w:val="0"/>
-          <w:i w:val="0"/>
-          <w:sz w:val="22"/>
-        </w:rPr>
-        <w:t>(Optional) Local utility or national water authority publications for Kampala/Uganda context.</w:t>
-      </w:r>
-    </w:p>
-    <w:p>
-      <w:pPr>
-        <w:pStyle w:val="Heading1"/>
-        <w:spacing w:before="240" w:after="80"/>
-      </w:pPr>
-      <w:r>
-        <w:t>Appendix A: Quick Formula Summary</w:t>
-      </w:r>
-    </w:p>
-    <w:p>
-      <w:pPr>
-        <w:pStyle w:val="ListNumber"/>
-        <w:spacing w:after="80"/>
-      </w:pPr>
-      <w:r>
-        <w:rPr>
-          <w:rFonts w:ascii="Calibri" w:hAnsi="Calibri"/>
-          <w:b/>
-          <w:i w:val="0"/>
-          <w:sz w:val="22"/>
-        </w:rPr>
-        <w:t xml:space="preserve">Shower (L/day):  </w:t>
-      </w:r>
-      <m:oMath>
-        <m:r>
-          <m:t>Q_{shower}</m:t>
-        </m:r>
-        <m:r>
-          <m:t> = </m:t>
-        </m:r>
-        <m:r>
-          <m:t>Flow rate (L/min)</m:t>
-        </m:r>
-        <m:r>
-          <m:t> × </m:t>
-        </m:r>
-        <m:r>
-          <m:t>Duration (min/day)</m:t>
-        </m:r>
-      </m:oMath>
-    </w:p>
-    <w:p>
-      <w:pPr>
-        <w:pStyle w:val="ListNumber"/>
-        <w:spacing w:after="80"/>
-      </w:pPr>
-      <w:r>
-        <w:rPr>
-          <w:rFonts w:ascii="Calibri" w:hAnsi="Calibri"/>
-          <w:b/>
-          <w:i w:val="0"/>
-          <w:sz w:val="22"/>
-        </w:rPr>
-        <w:t xml:space="preserve">Toilet (L/day):  </w:t>
-      </w:r>
-      <m:oMath>
-        <m:r>
-          <m:t>Q_{toilet}</m:t>
-        </m:r>
-        <m:r>
-          <m:t> = </m:t>
-        </m:r>
-        <m:r>
-          <m:t>Flush volume (L/flush)</m:t>
-        </m:r>
-        <m:r>
-          <m:t> × </m:t>
-        </m:r>
-        <m:r>
-          <m:t>Flushes per day</m:t>
-        </m:r>
-      </m:oMath>
-    </w:p>
-    <w:p>
-      <w:pPr>
-        <w:pStyle w:val="ListNumber"/>
-        <w:spacing w:after="80"/>
-      </w:pPr>
-      <w:r>
-        <w:rPr>
-          <w:rFonts w:ascii="Calibri" w:hAnsi="Calibri"/>
-          <w:b/>
-          <w:i w:val="0"/>
-          <w:sz w:val="22"/>
-        </w:rPr>
-        <w:t xml:space="preserve">Laundry (L/day):  </w:t>
-      </w:r>
-      <m:oMath>
-        <m:r>
-          <m:t>Q_{laundry}</m:t>
-        </m:r>
-        <m:r>
-          <m:t> = </m:t>
-        </m:r>
-        <m:f>
-          <m:num>
-            <m:r>
-              <m:t>Litres per load</m:t>
-            </m:r>
-          </m:num>
-          <m:den>
-            <m:r>
-              <m:t>7</m:t>
-            </m:r>
-          </m:den>
-        </m:f>
-      </m:oMath>
-    </w:p>
-    <w:p>
-      <w:pPr>
-        <w:pStyle w:val="ListNumber"/>
-        <w:spacing w:after="80"/>
-      </w:pPr>
-      <w:r>
-        <w:rPr>
-          <w:rFonts w:ascii="Calibri" w:hAnsi="Calibri"/>
-          <w:b/>
-          <w:i w:val="0"/>
-          <w:sz w:val="22"/>
-        </w:rPr>
-        <w:t xml:space="preserve">Chicken virtual water (L/day):  </w:t>
-      </w:r>
-      <m:oMath>
-        <m:r>
-          <m:t>VW_{chicken}</m:t>
-        </m:r>
-        <m:r>
-          <m:t> = </m:t>
-        </m:r>
-        <m:r>
-          <m:t>Chicken mass (kg/day)</m:t>
-        </m:r>
-        <m:r>
-          <m:t> × </m:t>
-        </m:r>
-        <m:r>
-          <m:t>4 300 (L/kg)</m:t>
-        </m:r>
-      </m:oMath>
-    </w:p>
-    <w:p>
-      <w:pPr>
-        <w:pStyle w:val="ListNumber"/>
-        <w:spacing w:after="80"/>
-      </w:pPr>
-      <w:r>
-        <w:rPr>
-          <w:rFonts w:ascii="Calibri" w:hAnsi="Calibri"/>
-          <w:b/>
-          <w:i w:val="0"/>
-          <w:sz w:val="22"/>
-        </w:rPr>
-        <w:t xml:space="preserve">Meal-based virtual water (L/day):  </w:t>
-      </w:r>
-      <m:oMath>
-        <m:r>
-          <m:t>VW_{meal}</m:t>
-        </m:r>
-        <m:r>
-          <m:t> = </m:t>
-        </m:r>
-        <m:r>
-          <m:t>Water per meal (L/meal)</m:t>
-        </m:r>
-        <m:r>
-          <m:t> × </m:t>
-        </m:r>
-        <m:r>
-          <m:t>Meals per day</m:t>
-        </m:r>
-      </m:oMath>
-    </w:p>
     <w:sectPr>
       <w:pgSz w:w="12240" w:h="15840"/>
       <w:pgMar w:top="1440" w:right="1440" w:bottom="1440" w:left="1701" w:header="720" w:footer="720" w:gutter="0"/>

</xml_diff>

<commit_message>
update Water_Consumption_Report for Makerere University student profile
Agent-Logs-Url: https://github.com/nsambatwalha-afk/g6-analysis-tool/sessions/7c45ff61-cb30-4f59-8b05-d29fb8134583

Co-authored-by: nsambatwalha-afk <266694608+nsambatwalha-afk@users.noreply.github.com>
</commit_message>
<xml_diff>
--- a/Water_Consumption_Report.docx
+++ b/Water_Consumption_Report.docx
@@ -64,7 +64,7 @@
           <w:i w:val="0"/>
           <w:sz w:val="22"/>
         </w:rPr>
-        <w:t>Showering: once per day</w:t>
+        <w:t>Showering: once per day (bucket shower, 1.5 buckets per shower)</w:t>
       </w:r>
     </w:p>
     <w:p>
@@ -79,7 +79,7 @@
           <w:i w:val="0"/>
           <w:sz w:val="22"/>
         </w:rPr>
-        <w:t>Eating: two meals per day, mainly fast foods (chicken)</w:t>
+        <w:t>Eating: one main meal per day (lunch) — rice and meat, or sometimes rice and beans</w:t>
       </w:r>
     </w:p>
     <w:p>
@@ -94,7 +94,7 @@
           <w:i w:val="0"/>
           <w:sz w:val="22"/>
         </w:rPr>
-        <w:t xml:space="preserve">Car washing: once per week (by hose)</w:t>
+        <w:t>Car washing: N/A (no car)</w:t>
       </w:r>
     </w:p>
     <w:p>
@@ -109,7 +109,7 @@
           <w:i w:val="0"/>
           <w:sz w:val="22"/>
         </w:rPr>
-        <w:t>Laundry: once per week</w:t>
+        <w:t>Laundry: once per week (by hand)</w:t>
       </w:r>
     </w:p>
     <w:p>
@@ -124,7 +124,7 @@
           <w:i w:val="0"/>
           <w:sz w:val="22"/>
         </w:rPr>
-        <w:t>Washroom visits: ~3 times per day (assumed 1 flush per visit)</w:t>
+        <w:t>Washroom visits: ~5 times per day (assumed 1 flush per visit)</w:t>
       </w:r>
     </w:p>
     <w:p>
@@ -166,7 +166,7 @@
           <w:i w:val="0"/>
           <w:sz w:val="22"/>
         </w:rPr>
-        <w:t>Typical shower flow rate: 9 L/min (standard showerhead)</w:t>
+        <w:t>Bucket capacity: 15 L/bucket (standard bucket)</w:t>
       </w:r>
     </w:p>
     <w:p>
@@ -181,7 +181,7 @@
           <w:i w:val="0"/>
           <w:sz w:val="22"/>
         </w:rPr>
-        <w:t>Typical duration: 8 minutes/shower</w:t>
+        <w:t>Buckets used per shower: 1.5</w:t>
       </w:r>
     </w:p>
     <w:p>
@@ -195,7 +195,7 @@
           <w:i w:val="0"/>
           <w:sz w:val="22"/>
         </w:rPr>
-        <w:t>Shower water per day:</w:t>
+        <w:t>Shower water per day:  15 × 1.5 = 22.5 L/day</w:t>
       </w:r>
     </w:p>
     <w:p>
@@ -263,7 +263,7 @@
           <w:i w:val="0"/>
           <w:sz w:val="22"/>
         </w:rPr>
-        <w:t>Flushes per day: 3 (one per washroom visit)</w:t>
+        <w:t>Flushes per day: 5 (one per washroom visit)</w:t>
       </w:r>
     </w:p>
     <w:p>
@@ -277,7 +277,7 @@
           <w:i w:val="0"/>
           <w:sz w:val="22"/>
         </w:rPr>
-        <w:t>Toilet water per day:</w:t>
+        <w:t>Toilet water per day:  6 × 5 = 30 L/day</w:t>
       </w:r>
     </w:p>
     <w:p>
@@ -315,7 +315,7 @@
         <w:spacing w:before="240" w:after="80"/>
       </w:pPr>
       <w:r>
-        <w:t xml:space="preserve">C)  Car Washing</w:t>
+        <w:t>C)  Car Washing</w:t>
       </w:r>
     </w:p>
     <w:p>
@@ -329,7 +329,7 @@
           <w:i w:val="0"/>
           <w:sz w:val="22"/>
         </w:rPr>
-        <w:t xml:space="preserve">I wash my car by hose once a week. I use 350 L/wash as the base estimate for an uncontrolled hose wash.</w:t>
+        <w:t>I do not own a car, so no water is used for car washing.</w:t>
       </w:r>
     </w:p>
     <w:p>
@@ -337,12 +337,12 @@
         <w:pStyle w:val="ListBullet"/>
       </w:pPr>
       <w:r>
-        <w:t xml:space="preserve">Hose wash (uncontrolled): 350 L/wash, once per week</w:t>
+        <w:t>Car wash: N/A — 0 L/day</w:t>
       </w:r>
     </w:p>
     <w:p>
       <w:r>
-        <w:t xml:space="preserve">Car wash water per day (average):</w:t>
+        <w:t>Car wash water per day:  0 L/day</w:t>
       </w:r>
     </w:p>
     <w:p>
@@ -377,7 +377,7 @@
           <w:i w:val="0"/>
           <w:sz w:val="22"/>
         </w:rPr>
-        <w:t>Typical washing machine water: ~100 L/load</w:t>
+        <w:t>Hand washing water: ~20 L/load</w:t>
       </w:r>
     </w:p>
     <w:p>
@@ -406,7 +406,7 @@
           <w:i w:val="0"/>
           <w:sz w:val="22"/>
         </w:rPr>
-        <w:t>Average laundry water per day:</w:t>
+        <w:t>Average laundry water per day:  20 ÷ 7 ≈ 2.9 L/day</w:t>
       </w:r>
     </w:p>
     <w:p>
@@ -461,7 +461,7 @@
           <w:i w:val="0"/>
           <w:sz w:val="22"/>
         </w:rPr>
-        <w:t xml:space="preserve">I eat two meals per day of mainly fast-food chicken. I apply the following water footprint factors:</w:t>
+        <w:t>I eat one main meal per day (lunch) — typically rice and meat, or sometimes rice and beans. I apply the following water footprint factors:</w:t>
       </w:r>
     </w:p>
     <w:p>
@@ -475,7 +475,7 @@
           <w:i w:val="0"/>
           <w:sz w:val="22"/>
         </w:rPr>
-        <w:t xml:space="preserve">Virtual water factor (global average):</w:t>
+        <w:t>Virtual water factors (global averages):</w:t>
       </w:r>
     </w:p>
     <w:p>
@@ -490,7 +490,7 @@
           <w:i w:val="0"/>
           <w:sz w:val="22"/>
         </w:rPr>
-        <w:t>Chicken meat water footprint ≈ 4,300 L/kg (global average; varies by production system and region)</w:t>
+        <w:t>Rice water footprint ≈ 2,500 L/kg</w:t>
       </w:r>
     </w:p>
     <w:p>
@@ -504,7 +504,7 @@
           <w:i w:val="0"/>
           <w:sz w:val="22"/>
         </w:rPr>
-        <w:t>Portion assumption:</w:t>
+        <w:t>Meat (beef) water footprint ≈ 15,400 L/kg</w:t>
       </w:r>
     </w:p>
     <w:p>
@@ -519,7 +519,7 @@
           <w:i w:val="0"/>
           <w:sz w:val="22"/>
         </w:rPr>
-        <w:t>Chicken per meal ≈ 150 g (0.15 kg) of chicken content (e.g., fillet, burger patty equivalent)</w:t>
+        <w:t>Beans water footprint ≈ 900 L/kg</w:t>
       </w:r>
     </w:p>
     <w:p>
@@ -534,7 +534,7 @@
           <w:i w:val="0"/>
           <w:sz w:val="22"/>
         </w:rPr>
-        <w:t>Two meals/day → chicken mass per day = 0.30 kg/day</w:t>
+        <w:t>Portion assumption:  Rice ≈ 200 g (0.2 kg);  Meat ≈ 100 g (0.1 kg) per meal</w:t>
       </w:r>
     </w:p>
     <w:p>
@@ -548,7 +548,7 @@
           <w:i w:val="0"/>
           <w:sz w:val="22"/>
         </w:rPr>
-        <w:t>Chicken-only indirect water estimate:</w:t>
+        <w:t>Indirect water per meal (rice + meat):</w:t>
       </w:r>
     </w:p>
     <w:p>
@@ -591,7 +591,7 @@
           <w:i w:val="0"/>
           <w:sz w:val="22"/>
         </w:rPr>
-        <w:t xml:space="preserve">Applying a meal multiplier that accounts for bun, fries, and condiments gives 1,800 L/meal:</w:t>
+        <w:t>Rice contribution: 0.2 × 2,500 = 500 L;  Meat contribution: 0.1 × 15,400 = 1,540 L → Total: 2,040 L/meal</w:t>
       </w:r>
     </w:p>
     <w:p>
@@ -709,7 +709,7 @@
           </w:tcPr>
           <w:p>
             <w:r>
-              <w:t>Shower</w:t>
+              <w:t>Shower (bucket)</w:t>
             </w:r>
           </w:p>
         </w:tc>
@@ -719,7 +719,7 @@
           </w:tcPr>
           <w:p>
             <w:r>
-              <w:t>9 L/min, 8 min</w:t>
+              <w:t>15 L/bucket, 1.5 buckets/shower</w:t>
             </w:r>
           </w:p>
         </w:tc>
@@ -729,7 +729,7 @@
           </w:tcPr>
           <w:p>
             <w:r>
-              <w:t>9 × 8</w:t>
+              <w:t>15 × 1.5</w:t>
             </w:r>
           </w:p>
         </w:tc>
@@ -739,7 +739,7 @@
           </w:tcPr>
           <w:p>
             <w:r>
-              <w:t>72</w:t>
+              <w:t>22.5</w:t>
             </w:r>
           </w:p>
         </w:tc>
@@ -761,7 +761,7 @@
           </w:tcPr>
           <w:p>
             <w:r>
-              <w:t>6 L/flush, 3/day</w:t>
+              <w:t>6 L/flush, 5/day</w:t>
             </w:r>
           </w:p>
         </w:tc>
@@ -771,7 +771,7 @@
           </w:tcPr>
           <w:p>
             <w:r>
-              <w:t>6 × 3</w:t>
+              <w:t>6 × 5</w:t>
             </w:r>
           </w:p>
         </w:tc>
@@ -781,7 +781,7 @@
           </w:tcPr>
           <w:p>
             <w:r>
-              <w:t>18</w:t>
+              <w:t>30</w:t>
             </w:r>
           </w:p>
         </w:tc>
@@ -803,7 +803,7 @@
           </w:tcPr>
           <w:p>
             <w:r>
-              <w:t>Hose wash, 350 L/wash, 1×/week</w:t>
+              <w:t>No car</w:t>
             </w:r>
           </w:p>
         </w:tc>
@@ -813,7 +813,7 @@
           </w:tcPr>
           <w:p>
             <w:r>
-              <w:t>350 ÷ 7</w:t>
+              <w:t>N/A</w:t>
             </w:r>
           </w:p>
         </w:tc>
@@ -823,7 +823,7 @@
           </w:tcPr>
           <w:p>
             <w:r>
-              <w:t>50</w:t>
+              <w:t>0</w:t>
             </w:r>
           </w:p>
         </w:tc>
@@ -835,7 +835,7 @@
           </w:tcPr>
           <w:p>
             <w:r>
-              <w:t>Laundry</w:t>
+              <w:t>Laundry (hand wash)</w:t>
             </w:r>
           </w:p>
         </w:tc>
@@ -845,7 +845,7 @@
           </w:tcPr>
           <w:p>
             <w:r>
-              <w:t>100 L/week</w:t>
+              <w:t>20 L/week</w:t>
             </w:r>
           </w:p>
         </w:tc>
@@ -855,7 +855,7 @@
           </w:tcPr>
           <w:p>
             <w:r>
-              <w:t>100 ÷ 7</w:t>
+              <w:t>20 ÷ 7</w:t>
             </w:r>
           </w:p>
         </w:tc>
@@ -865,7 +865,7 @@
           </w:tcPr>
           <w:p>
             <w:r>
-              <w:t>14</w:t>
+              <w:t>2.9</w:t>
             </w:r>
           </w:p>
         </w:tc>
@@ -929,7 +929,7 @@
                 <w:i w:val="0"/>
                 <w:sz w:val="22"/>
               </w:rPr>
-              <w:t>154</w:t>
+              <w:t>55</w:t>
             </w:r>
           </w:p>
         </w:tc>
@@ -946,7 +946,7 @@
           <w:i w:val="0"/>
           <w:sz w:val="22"/>
         </w:rPr>
-        <w:t xml:space="preserve">Weekly and annual figures (direct):</w:t>
+        <w:t>Weekly and annual figures (direct):</w:t>
       </w:r>
     </w:p>
     <w:p>
@@ -1057,7 +1057,7 @@
           </w:tcPr>
           <w:p>
             <w:r>
-              <w:t>Fast-food meals (chicken-based)</w:t>
+              <w:t>Lunch — rice and meat</w:t>
             </w:r>
           </w:p>
         </w:tc>
@@ -1067,7 +1067,7 @@
           </w:tcPr>
           <w:p>
             <w:r>
-              <w:t>1 800 L/meal</w:t>
+              <w:t>Rice: 2,500 L/kg (0.2 kg); Meat: 15,400 L/kg (0.1 kg)</w:t>
             </w:r>
           </w:p>
         </w:tc>
@@ -1077,7 +1077,7 @@
           </w:tcPr>
           <w:p>
             <w:r>
-              <w:t>1 800 × 2</w:t>
+              <w:t>(0.2×2,500)+(0.1×15,400)</w:t>
             </w:r>
           </w:p>
         </w:tc>
@@ -1087,7 +1087,7 @@
           </w:tcPr>
           <w:p>
             <w:r>
-              <w:t>3 600</w:t>
+              <w:t>2,040</w:t>
             </w:r>
           </w:p>
         </w:tc>
@@ -1104,7 +1104,7 @@
           <w:i w:val="0"/>
           <w:sz w:val="22"/>
         </w:rPr>
-        <w:t xml:space="preserve">Weekly and annual figures (indirect):</w:t>
+        <w:t>Weekly and annual figures (indirect):</w:t>
       </w:r>
     </w:p>
     <w:p>
@@ -1261,7 +1261,7 @@
           </w:tcPr>
           <w:p>
             <w:r>
-              <w:t>154</w:t>
+              <w:t>55</w:t>
             </w:r>
           </w:p>
         </w:tc>
@@ -1271,7 +1271,7 @@
           </w:tcPr>
           <w:p>
             <w:r>
-              <w:t>1 078</w:t>
+              <w:t>385</w:t>
             </w:r>
           </w:p>
         </w:tc>
@@ -1281,7 +1281,7 @@
           </w:tcPr>
           <w:p>
             <w:r>
-              <w:t>56 210</w:t>
+              <w:t>20 075</w:t>
             </w:r>
           </w:p>
         </w:tc>
@@ -1303,7 +1303,7 @@
           </w:tcPr>
           <w:p>
             <w:r>
-              <w:t>3 600</w:t>
+              <w:t>2 040</w:t>
             </w:r>
           </w:p>
         </w:tc>
@@ -1313,7 +1313,7 @@
           </w:tcPr>
           <w:p>
             <w:r>
-              <w:t>25 200</w:t>
+              <w:t>14 280</w:t>
             </w:r>
           </w:p>
         </w:tc>
@@ -1323,7 +1323,7 @@
           </w:tcPr>
           <w:p>
             <w:r>
-              <w:t>1 314 000</w:t>
+              <w:t>744 600</w:t>
             </w:r>
           </w:p>
         </w:tc>
@@ -1357,7 +1357,7 @@
                 <w:i w:val="0"/>
                 <w:sz w:val="22"/>
               </w:rPr>
-              <w:t>3 754</w:t>
+              <w:t>2 095</w:t>
             </w:r>
           </w:p>
         </w:tc>
@@ -1373,7 +1373,7 @@
                 <w:i w:val="0"/>
                 <w:sz w:val="22"/>
               </w:rPr>
-              <w:t>26 278</w:t>
+              <w:t>14 665</w:t>
             </w:r>
           </w:p>
         </w:tc>
@@ -1389,7 +1389,7 @@
                 <w:i w:val="0"/>
                 <w:sz w:val="22"/>
               </w:rPr>
-              <w:t>1 370 210</w:t>
+              <w:t>764 675</w:t>
             </w:r>
           </w:p>
         </w:tc>
@@ -1426,7 +1426,7 @@
           <w:i w:val="0"/>
           <w:sz w:val="22"/>
         </w:rPr>
-        <w:t xml:space="preserve">The two main sources of variation are shower flow rate and hose water volume.</w:t>
+        <w:t>The two main sources of variation are bucket size and food choice (meat vs beans).</w:t>
       </w:r>
     </w:p>
     <w:p>
@@ -1435,7 +1435,7 @@
         <w:spacing w:before="240" w:after="80"/>
       </w:pPr>
       <w:r>
-        <w:t xml:space="preserve">3.1  Car Wash Sensitivity (once per week by hose)</w:t>
+        <w:t>3.1  Shower Bucket Size Sensitivity</w:t>
       </w:r>
     </w:p>
     <w:p>
@@ -1450,7 +1450,7 @@
           <w:i w:val="0"/>
           <w:sz w:val="22"/>
         </w:rPr>
-        <w:t xml:space="preserve">Low estimate: ~9 L/day (bucket wash, 60 L/wash ÷ 7 days)</w:t>
+        <w:t>Low estimate: ~15 L/day (small bucket, 10 L/bucket × 1.5 buckets)</w:t>
       </w:r>
     </w:p>
     <w:p>
@@ -1465,7 +1465,7 @@
           <w:i w:val="0"/>
           <w:sz w:val="22"/>
         </w:rPr>
-        <w:t xml:space="preserve">Base estimate: ~50 L/day (hose wash, 350 L/wash ÷ 7 days)</w:t>
+        <w:t>Base estimate: ~22.5 L/day (standard 15 L bucket × 1.5 buckets)  ← base case</w:t>
       </w:r>
     </w:p>
     <w:p>
@@ -1480,7 +1480,7 @@
           <w:i w:val="0"/>
           <w:sz w:val="22"/>
         </w:rPr>
-        <w:t xml:space="preserve">High estimate: ~71 L/day (hose wash, 500 L/wash ÷ 7 days)</w:t>
+        <w:t>High estimate: ~30 L/day (large 20 L bucket × 1.5 buckets)</w:t>
       </w:r>
     </w:p>
     <w:p>
@@ -1489,7 +1489,7 @@
         <w:spacing w:before="240" w:after="80"/>
       </w:pPr>
       <w:r>
-        <w:t xml:space="preserve">3.2  Shower Sensitivity</w:t>
+        <w:t>3.2  Food Choice Sensitivity (Indirect Water)</w:t>
       </w:r>
     </w:p>
     <w:p>
@@ -1504,7 +1504,7 @@
           <w:i w:val="0"/>
           <w:sz w:val="22"/>
         </w:rPr>
-        <w:t>Low-flow showerhead (~6 L/min) × 8 min = 48 L/day</w:t>
+        <w:t>Rice + beans: (0.2 × 2,500) + (0.15 × 900) = 500 + 135 = 635 L/day</w:t>
       </w:r>
     </w:p>
     <w:p>
@@ -1519,7 +1519,7 @@
           <w:i w:val="0"/>
           <w:sz w:val="22"/>
         </w:rPr>
-        <w:t>Standard (9 L/min) × 8 min = 72 L/day  ← base case</w:t>
+        <w:t>Rice + meat (beef): (0.2 × 2,500) + (0.1 × 15,400) = 500 + 1,540 = 2,040 L/day  ← base case</w:t>
       </w:r>
     </w:p>
     <w:p>
@@ -1534,7 +1534,6 @@
           <w:i w:val="0"/>
           <w:sz w:val="22"/>
         </w:rPr>
-        <w:t>Longer shower (9 L/min × 12 min) = 108 L/day</w:t>
       </w:r>
     </w:p>
     <w:p>
@@ -1625,7 +1624,7 @@
           </w:tcPr>
           <w:p>
             <w:r>
-              <w:t>48 (shower) + 18 (toilet) + 9 (bucket wash ÷7) + 14 (laundry)</w:t>
+              <w:t>15 (shower) + 30 (toilet) + 3 (laundry)</w:t>
             </w:r>
           </w:p>
         </w:tc>
@@ -1635,7 +1634,7 @@
           </w:tcPr>
           <w:p>
             <w:r>
-              <w:t>~89</w:t>
+              <w:t>~48</w:t>
             </w:r>
           </w:p>
         </w:tc>
@@ -1657,7 +1656,7 @@
           </w:tcPr>
           <w:p>
             <w:r>
-              <w:t>108 (shower) + 18 (toilet) + 71 (hose wash ÷7) + 14 (laundry)</w:t>
+              <w:t>30 (shower) + 30 (toilet) + 3 (laundry)</w:t>
             </w:r>
           </w:p>
         </w:tc>
@@ -1667,7 +1666,7 @@
           </w:tcPr>
           <w:p>
             <w:r>
-              <w:t>~211</w:t>
+              <w:t>~63</w:t>
             </w:r>
           </w:p>
         </w:tc>

</xml_diff>